<commit_message>
Align capture guide and evidence with integrated release
</commit_message>
<xml_diff>
--- a/deliverables/Qorgau_plan_semki_foto_i_video.docx
+++ b/deliverables/Qorgau_plan_semki_foto_i_video.docx
@@ -2912,7 +2912,7 @@
       </w:pPr>
       <w:r>
         <w:rPr/>
-        <w:t>Между кадрами меняйте положение рук, ракурс телефона и посадку. Почти одинаковую серию заменяйте новыми позами.</w:t>
+        <w:t>Меняйте положение рук, ракурс телефона и посадку. Заменяйте почти одинаковые кадры.</w:t>
       </w:r>
     </w:p>
     <w:p>
@@ -2930,13 +2930,13 @@
       </w:pPr>
       <w:r>
         <w:rPr/>
-        <w:t>Чередуйте обычный, боковой и более тусклый свет, при котором предметы ещё различимы. Эти варианты входят в указанные количества.</w:t>
+        <w:t>Чередуйте обычный, боковой и тусклый свет, при котором предметы ещё различимы.</w:t>
       </w:r>
     </w:p>
     <w:p>
       <w:r>
         <w:rPr/>
-        <w:t>В 05_partial телефон должен оставаться различимым. Полностью скрытый телефон не размечается как видимый объект. В 06_no_phone не должно быть другого видимого телефона, например на столе.</w:t>
+        <w:t>В 05_partial телефон должен быть различим. Полностью скрытый телефон не размечаем. В 06_no_phone исключите все видимые телефоны, в том числе на столе.</w:t>
       </w:r>
     </w:p>
     <w:p>
@@ -5352,7 +5352,7 @@
     <w:p>
       <w:r>
         <w:rPr/>
-        <w:t>При сборке 0.3.0 событие учитывается после 5 секунд уверенного непрерывного ухода взгляда. Блокировка возникает после трёх эпизодов в одном направлении. Фактический результат записывайте как получился; отсутствие ожидаемого события тоже полезно. Это не проверка строгой защиты Windows.</w:t>
+        <w:t>При сборке 0.4.0 событие учитывается после 5 секунд уверенного непрерывного ухода взгляда. Блокировка возникает после трёх эпизодов в одном направлении. Фактический результат записывайте как получился; отсутствие ожидаемого события тоже полезно. Это не проверка строгой защиты Windows.</w:t>
       </w:r>
     </w:p>
     <w:p>
@@ -6734,7 +6734,7 @@
     <w:p>
       <w:r>
         <w:rPr/>
-        <w:t>Перед обучением потребуется адаптировать проверку данных в train_phone.py: сейчас она требует пять участников. Сеансы должны оставаться сеансами одного P01; выдавать их за разных людей нельзя.</w:t>
+        <w:t>В 0.4.0 train_phone.py поддерживает одного участника: split_policy: session, отдельные S01, S02, S03. Это сеансы одного P01, а не разные люди. Манифест подготовит Codex после съёмки.</w:t>
       </w:r>
     </w:p>
     <w:p>
@@ -6750,7 +6750,7 @@
         <w:rPr>
           <w:sz w:val="18"/>
         </w:rPr>
-        <w:t>Основа плана: согласованные сценарии съёмки; docs/CV_EVALUATION.md; shared/rules.py, версия правил 3.0. Количество фото — рабочий объём первого эксперимента, а не норматив точности. Методические рекомендации: https://docs.ultralytics.com/guides/data-collection-and-annotation</w:t>
+        <w:t>Основа: docs/CV_EVALUATION.md и правила 3.0. Количество фото — объём первого эксперимента, а не норматив точности. Разметка: https://docs.ultralytics.com/guides/data-collection-and-annotation</w:t>
       </w:r>
     </w:p>
     <w:sectPr>

</xml_diff>